<commit_message>
Corrige redaccion de la seccion 5 del informe (limpieza de combinaciones iniciales si esta implementada).
</commit_message>
<xml_diff>
--- a/Informe Desarrollo Desafío_1.docx
+++ b/Informe Desarrollo Desafío_1.docx
@@ -127,7 +127,7 @@
         <w:rPr>
           <w:noProof/>
         </w:rPr>
-        <w:pict w14:anchorId="1902A973">
+        <w:pict w14:anchorId="482CA815">
           <v:rect id="_x0000_i1025" alt="" style="width:441.9pt;height:.05pt;mso-width-percent:0;mso-height-percent:0;mso-width-percent:0;mso-height-percent:0" o:hralign="center" o:hrstd="t" o:hr="t"/>
         </w:pict>
       </w:r>
@@ -1501,6 +1501,15 @@
       <w:pPr>
         <w:pStyle w:val="Prrafodelista"/>
         <w:spacing w:after="0" w:line="240" w:lineRule="auto"/>
+      </w:pPr>
+      <w:r>
+        <w:t>Como decisión de diseño y para garantizar una experiencia de juego justa, se implementó un proceso de limpieza de combinaciones inmediatamente después de crear el tablero e inicializarlo con fichas aleatorias, con el fin de validar que no existan jugadas tomadas como válidas provenientes de una combinación automática. De esta manera, si el tablero inicial genera combinaciones de forma automática, estas se resuelven antes de iniciar la partida, sin otorgarle al jugador puntos "gratis" ni contabilizar cascadas. Así, el juego inicia en un estado neutro de 0 combinaciones disponibles, asegurando que todo puntaje obtenido sea mérito de las decisiones del usuario.</w:t>
+      </w:r>
+    </w:p>
+    <w:p>
+      <w:pPr>
+        <w:pStyle w:val="Prrafodelista"/>
+        <w:spacing w:after="0" w:line="240" w:lineRule="auto"/>
         <w:rPr>
           <w:rFonts w:eastAsia="Times New Roman" w:cs="Times New Roman"/>
           <w:kern w:val="0"/>
@@ -1508,31 +1517,14 @@
           <w14:ligatures w14:val="none"/>
         </w:rPr>
       </w:pPr>
-      <w:r>
-        <w:rPr>
-          <w:rFonts w:eastAsia="Times New Roman" w:cs="Times New Roman"/>
-          <w:kern w:val="0"/>
-          <w:lang w:eastAsia="es-MX"/>
-          <w14:ligatures w14:val="none"/>
-        </w:rPr>
-        <w:t>Como decisión de diseño a implementar posteriormente y para garantizar una experiencia de juego justa, se planteó (mas no se desarrolló) un proceso de limpieza de combinaciones inmediatamente después de crear el tablero e inicializarlo con fichas aleatorias, con el fin de validar que no existieran jugadas tomadas como válidas provenientes de una combinación automática. De esta manera, si el tablero inicial generara combinaciones de forma automática, estas se resolverían antes de iniciar la partida, sin otorgarle al jugador puntos "gratis" ni contabilizar cascadas. Así, el juego iniciaría en un estado neutro de 0 combinaciones disponibles, asegurando que todo puntaje obtenido fuera mérito de las decisiones del usuario.</w:t>
-      </w:r>
     </w:p>
     <w:p>
       <w:pPr>
         <w:pStyle w:val="Prrafodelista"/>
-        <w:spacing w:after="0" w:line="240" w:lineRule="auto"/>
-        <w:rPr>
-          <w:rFonts w:eastAsia="Times New Roman" w:cs="Times New Roman"/>
-          <w:kern w:val="0"/>
-          <w:lang w:eastAsia="es-MX"/>
-          <w14:ligatures w14:val="none"/>
-        </w:rPr>
-      </w:pPr>
-    </w:p>
-    <w:p>
-      <w:pPr>
-        <w:pStyle w:val="Prrafodelista"/>
+        <w:numPr>
+          <w:ilvl w:val="0"/>
+          <w:numId w:val="32"/>
+        </w:numPr>
         <w:spacing w:after="0" w:line="240" w:lineRule="auto"/>
         <w:rPr>
           <w:rFonts w:eastAsia="Times New Roman" w:cs="Times New Roman"/>
@@ -3866,6 +3858,304 @@
     </w:lvl>
   </w:abstractNum>
   <w:abstractNum w:abstractNumId="14" w15:restartNumberingAfterBreak="0">
+    <w:nsid w:val="4358529F"/>
+    <w:multiLevelType w:val="multilevel"/>
+    <w:tmpl w:val="0AD26E3C"/>
+    <w:lvl w:ilvl="0">
+      <w:start w:val="1"/>
+      <w:numFmt w:val="bullet"/>
+      <w:lvlText w:val=""/>
+      <w:lvlJc w:val="left"/>
+      <w:pPr>
+        <w:tabs>
+          <w:tab w:val="num" w:pos="720"/>
+        </w:tabs>
+        <w:ind w:left="720" w:hanging="360"/>
+      </w:pPr>
+      <w:rPr>
+        <w:rFonts w:ascii="Symbol" w:hAnsi="Symbol" w:hint="default"/>
+        <w:sz w:val="20"/>
+      </w:rPr>
+    </w:lvl>
+    <w:lvl w:ilvl="1" w:tentative="1">
+      <w:start w:val="1"/>
+      <w:numFmt w:val="bullet"/>
+      <w:lvlText w:val="o"/>
+      <w:lvlJc w:val="left"/>
+      <w:pPr>
+        <w:tabs>
+          <w:tab w:val="num" w:pos="1440"/>
+        </w:tabs>
+        <w:ind w:left="1440" w:hanging="360"/>
+      </w:pPr>
+      <w:rPr>
+        <w:rFonts w:ascii="Courier New" w:hAnsi="Courier New" w:hint="default"/>
+        <w:sz w:val="20"/>
+      </w:rPr>
+    </w:lvl>
+    <w:lvl w:ilvl="2" w:tentative="1">
+      <w:start w:val="1"/>
+      <w:numFmt w:val="bullet"/>
+      <w:lvlText w:val=""/>
+      <w:lvlJc w:val="left"/>
+      <w:pPr>
+        <w:tabs>
+          <w:tab w:val="num" w:pos="2160"/>
+        </w:tabs>
+        <w:ind w:left="2160" w:hanging="360"/>
+      </w:pPr>
+      <w:rPr>
+        <w:rFonts w:ascii="Wingdings" w:hAnsi="Wingdings" w:hint="default"/>
+        <w:sz w:val="20"/>
+      </w:rPr>
+    </w:lvl>
+    <w:lvl w:ilvl="3" w:tentative="1">
+      <w:start w:val="1"/>
+      <w:numFmt w:val="bullet"/>
+      <w:lvlText w:val=""/>
+      <w:lvlJc w:val="left"/>
+      <w:pPr>
+        <w:tabs>
+          <w:tab w:val="num" w:pos="2880"/>
+        </w:tabs>
+        <w:ind w:left="2880" w:hanging="360"/>
+      </w:pPr>
+      <w:rPr>
+        <w:rFonts w:ascii="Wingdings" w:hAnsi="Wingdings" w:hint="default"/>
+        <w:sz w:val="20"/>
+      </w:rPr>
+    </w:lvl>
+    <w:lvl w:ilvl="4" w:tentative="1">
+      <w:start w:val="1"/>
+      <w:numFmt w:val="bullet"/>
+      <w:lvlText w:val=""/>
+      <w:lvlJc w:val="left"/>
+      <w:pPr>
+        <w:tabs>
+          <w:tab w:val="num" w:pos="3600"/>
+        </w:tabs>
+        <w:ind w:left="3600" w:hanging="360"/>
+      </w:pPr>
+      <w:rPr>
+        <w:rFonts w:ascii="Wingdings" w:hAnsi="Wingdings" w:hint="default"/>
+        <w:sz w:val="20"/>
+      </w:rPr>
+    </w:lvl>
+    <w:lvl w:ilvl="5" w:tentative="1">
+      <w:start w:val="1"/>
+      <w:numFmt w:val="bullet"/>
+      <w:lvlText w:val=""/>
+      <w:lvlJc w:val="left"/>
+      <w:pPr>
+        <w:tabs>
+          <w:tab w:val="num" w:pos="4320"/>
+        </w:tabs>
+        <w:ind w:left="4320" w:hanging="360"/>
+      </w:pPr>
+      <w:rPr>
+        <w:rFonts w:ascii="Wingdings" w:hAnsi="Wingdings" w:hint="default"/>
+        <w:sz w:val="20"/>
+      </w:rPr>
+    </w:lvl>
+    <w:lvl w:ilvl="6" w:tentative="1">
+      <w:start w:val="1"/>
+      <w:numFmt w:val="bullet"/>
+      <w:lvlText w:val=""/>
+      <w:lvlJc w:val="left"/>
+      <w:pPr>
+        <w:tabs>
+          <w:tab w:val="num" w:pos="5040"/>
+        </w:tabs>
+        <w:ind w:left="5040" w:hanging="360"/>
+      </w:pPr>
+      <w:rPr>
+        <w:rFonts w:ascii="Wingdings" w:hAnsi="Wingdings" w:hint="default"/>
+        <w:sz w:val="20"/>
+      </w:rPr>
+    </w:lvl>
+    <w:lvl w:ilvl="7" w:tentative="1">
+      <w:start w:val="1"/>
+      <w:numFmt w:val="bullet"/>
+      <w:lvlText w:val=""/>
+      <w:lvlJc w:val="left"/>
+      <w:pPr>
+        <w:tabs>
+          <w:tab w:val="num" w:pos="5760"/>
+        </w:tabs>
+        <w:ind w:left="5760" w:hanging="360"/>
+      </w:pPr>
+      <w:rPr>
+        <w:rFonts w:ascii="Wingdings" w:hAnsi="Wingdings" w:hint="default"/>
+        <w:sz w:val="20"/>
+      </w:rPr>
+    </w:lvl>
+    <w:lvl w:ilvl="8" w:tentative="1">
+      <w:start w:val="1"/>
+      <w:numFmt w:val="bullet"/>
+      <w:lvlText w:val=""/>
+      <w:lvlJc w:val="left"/>
+      <w:pPr>
+        <w:tabs>
+          <w:tab w:val="num" w:pos="6480"/>
+        </w:tabs>
+        <w:ind w:left="6480" w:hanging="360"/>
+      </w:pPr>
+      <w:rPr>
+        <w:rFonts w:ascii="Wingdings" w:hAnsi="Wingdings" w:hint="default"/>
+        <w:sz w:val="20"/>
+      </w:rPr>
+    </w:lvl>
+  </w:abstractNum>
+  <w:abstractNum w:abstractNumId="15" w15:restartNumberingAfterBreak="0">
+    <w:nsid w:val="44047DE9"/>
+    <w:multiLevelType w:val="multilevel"/>
+    <w:tmpl w:val="0AD26E3C"/>
+    <w:lvl w:ilvl="0">
+      <w:start w:val="1"/>
+      <w:numFmt w:val="bullet"/>
+      <w:lvlText w:val=""/>
+      <w:lvlJc w:val="left"/>
+      <w:pPr>
+        <w:tabs>
+          <w:tab w:val="num" w:pos="720"/>
+        </w:tabs>
+        <w:ind w:left="720" w:hanging="360"/>
+      </w:pPr>
+      <w:rPr>
+        <w:rFonts w:ascii="Symbol" w:hAnsi="Symbol" w:hint="default"/>
+        <w:sz w:val="20"/>
+      </w:rPr>
+    </w:lvl>
+    <w:lvl w:ilvl="1">
+      <w:start w:val="1"/>
+      <w:numFmt w:val="bullet"/>
+      <w:lvlText w:val="o"/>
+      <w:lvlJc w:val="left"/>
+      <w:pPr>
+        <w:tabs>
+          <w:tab w:val="num" w:pos="1440"/>
+        </w:tabs>
+        <w:ind w:left="1440" w:hanging="360"/>
+      </w:pPr>
+      <w:rPr>
+        <w:rFonts w:ascii="Courier New" w:hAnsi="Courier New" w:hint="default"/>
+        <w:sz w:val="20"/>
+      </w:rPr>
+    </w:lvl>
+    <w:lvl w:ilvl="2" w:tentative="1">
+      <w:start w:val="1"/>
+      <w:numFmt w:val="bullet"/>
+      <w:lvlText w:val=""/>
+      <w:lvlJc w:val="left"/>
+      <w:pPr>
+        <w:tabs>
+          <w:tab w:val="num" w:pos="2160"/>
+        </w:tabs>
+        <w:ind w:left="2160" w:hanging="360"/>
+      </w:pPr>
+      <w:rPr>
+        <w:rFonts w:ascii="Wingdings" w:hAnsi="Wingdings" w:hint="default"/>
+        <w:sz w:val="20"/>
+      </w:rPr>
+    </w:lvl>
+    <w:lvl w:ilvl="3" w:tentative="1">
+      <w:start w:val="1"/>
+      <w:numFmt w:val="bullet"/>
+      <w:lvlText w:val=""/>
+      <w:lvlJc w:val="left"/>
+      <w:pPr>
+        <w:tabs>
+          <w:tab w:val="num" w:pos="2880"/>
+        </w:tabs>
+        <w:ind w:left="2880" w:hanging="360"/>
+      </w:pPr>
+      <w:rPr>
+        <w:rFonts w:ascii="Wingdings" w:hAnsi="Wingdings" w:hint="default"/>
+        <w:sz w:val="20"/>
+      </w:rPr>
+    </w:lvl>
+    <w:lvl w:ilvl="4" w:tentative="1">
+      <w:start w:val="1"/>
+      <w:numFmt w:val="bullet"/>
+      <w:lvlText w:val=""/>
+      <w:lvlJc w:val="left"/>
+      <w:pPr>
+        <w:tabs>
+          <w:tab w:val="num" w:pos="3600"/>
+        </w:tabs>
+        <w:ind w:left="3600" w:hanging="360"/>
+      </w:pPr>
+      <w:rPr>
+        <w:rFonts w:ascii="Wingdings" w:hAnsi="Wingdings" w:hint="default"/>
+        <w:sz w:val="20"/>
+      </w:rPr>
+    </w:lvl>
+    <w:lvl w:ilvl="5" w:tentative="1">
+      <w:start w:val="1"/>
+      <w:numFmt w:val="bullet"/>
+      <w:lvlText w:val=""/>
+      <w:lvlJc w:val="left"/>
+      <w:pPr>
+        <w:tabs>
+          <w:tab w:val="num" w:pos="4320"/>
+        </w:tabs>
+        <w:ind w:left="4320" w:hanging="360"/>
+      </w:pPr>
+      <w:rPr>
+        <w:rFonts w:ascii="Wingdings" w:hAnsi="Wingdings" w:hint="default"/>
+        <w:sz w:val="20"/>
+      </w:rPr>
+    </w:lvl>
+    <w:lvl w:ilvl="6" w:tentative="1">
+      <w:start w:val="1"/>
+      <w:numFmt w:val="bullet"/>
+      <w:lvlText w:val=""/>
+      <w:lvlJc w:val="left"/>
+      <w:pPr>
+        <w:tabs>
+          <w:tab w:val="num" w:pos="5040"/>
+        </w:tabs>
+        <w:ind w:left="5040" w:hanging="360"/>
+      </w:pPr>
+      <w:rPr>
+        <w:rFonts w:ascii="Wingdings" w:hAnsi="Wingdings" w:hint="default"/>
+        <w:sz w:val="20"/>
+      </w:rPr>
+    </w:lvl>
+    <w:lvl w:ilvl="7" w:tentative="1">
+      <w:start w:val="1"/>
+      <w:numFmt w:val="bullet"/>
+      <w:lvlText w:val=""/>
+      <w:lvlJc w:val="left"/>
+      <w:pPr>
+        <w:tabs>
+          <w:tab w:val="num" w:pos="5760"/>
+        </w:tabs>
+        <w:ind w:left="5760" w:hanging="360"/>
+      </w:pPr>
+      <w:rPr>
+        <w:rFonts w:ascii="Wingdings" w:hAnsi="Wingdings" w:hint="default"/>
+        <w:sz w:val="20"/>
+      </w:rPr>
+    </w:lvl>
+    <w:lvl w:ilvl="8" w:tentative="1">
+      <w:start w:val="1"/>
+      <w:numFmt w:val="bullet"/>
+      <w:lvlText w:val=""/>
+      <w:lvlJc w:val="left"/>
+      <w:pPr>
+        <w:tabs>
+          <w:tab w:val="num" w:pos="6480"/>
+        </w:tabs>
+        <w:ind w:left="6480" w:hanging="360"/>
+      </w:pPr>
+      <w:rPr>
+        <w:rFonts w:ascii="Wingdings" w:hAnsi="Wingdings" w:hint="default"/>
+        <w:sz w:val="20"/>
+      </w:rPr>
+    </w:lvl>
+  </w:abstractNum>
+  <w:abstractNum w:abstractNumId="16" w15:restartNumberingAfterBreak="0">
     <w:nsid w:val="46270ADF"/>
     <w:multiLevelType w:val="hybridMultilevel"/>
     <w:tmpl w:val="97B210DA"/>
@@ -3978,7 +4268,7 @@
       </w:rPr>
     </w:lvl>
   </w:abstractNum>
-  <w:abstractNum w:abstractNumId="15" w15:restartNumberingAfterBreak="0">
+  <w:abstractNum w:abstractNumId="17" w15:restartNumberingAfterBreak="0">
     <w:nsid w:val="5C9F01E6"/>
     <w:multiLevelType w:val="multilevel"/>
     <w:tmpl w:val="0AD26E3C"/>
@@ -4127,7 +4417,7 @@
       </w:rPr>
     </w:lvl>
   </w:abstractNum>
-  <w:abstractNum w:abstractNumId="16" w15:restartNumberingAfterBreak="0">
+  <w:abstractNum w:abstractNumId="18" w15:restartNumberingAfterBreak="0">
     <w:nsid w:val="63AF74FE"/>
     <w:multiLevelType w:val="multilevel"/>
     <w:tmpl w:val="0AD26E3C"/>
@@ -4276,7 +4566,7 @@
       </w:rPr>
     </w:lvl>
   </w:abstractNum>
-  <w:abstractNum w:abstractNumId="17" w15:restartNumberingAfterBreak="0">
+  <w:abstractNum w:abstractNumId="19" w15:restartNumberingAfterBreak="0">
     <w:nsid w:val="6A40730C"/>
     <w:multiLevelType w:val="multilevel"/>
     <w:tmpl w:val="B0ECC1D4"/>
@@ -4425,7 +4715,7 @@
       </w:rPr>
     </w:lvl>
   </w:abstractNum>
-  <w:abstractNum w:abstractNumId="18" w15:restartNumberingAfterBreak="0">
+  <w:abstractNum w:abstractNumId="20" w15:restartNumberingAfterBreak="0">
     <w:nsid w:val="71023500"/>
     <w:multiLevelType w:val="hybridMultilevel"/>
     <w:tmpl w:val="0E5C5F0C"/>
@@ -4538,7 +4828,7 @@
       </w:rPr>
     </w:lvl>
   </w:abstractNum>
-  <w:abstractNum w:abstractNumId="19" w15:restartNumberingAfterBreak="0">
+  <w:abstractNum w:abstractNumId="21" w15:restartNumberingAfterBreak="0">
     <w:nsid w:val="780D5F5B"/>
     <w:multiLevelType w:val="multilevel"/>
     <w:tmpl w:val="C6CAE042"/>
@@ -4651,7 +4941,7 @@
       </w:pPr>
     </w:lvl>
   </w:abstractNum>
-  <w:abstractNum w:abstractNumId="20" w15:restartNumberingAfterBreak="0">
+  <w:abstractNum w:abstractNumId="22" w15:restartNumberingAfterBreak="0">
     <w:nsid w:val="782856E2"/>
     <w:multiLevelType w:val="hybridMultilevel"/>
     <w:tmpl w:val="A9A6BD90"/>
@@ -4764,7 +5054,7 @@
       </w:rPr>
     </w:lvl>
   </w:abstractNum>
-  <w:abstractNum w:abstractNumId="21" w15:restartNumberingAfterBreak="0">
+  <w:abstractNum w:abstractNumId="23" w15:restartNumberingAfterBreak="0">
     <w:nsid w:val="7BC45DE0"/>
     <w:multiLevelType w:val="multilevel"/>
     <w:tmpl w:val="0AD26E3C"/>
@@ -5020,13 +5310,13 @@
     <w:abstractNumId w:val="4"/>
   </w:num>
   <w:num w:numId="13" w16cid:durableId="1125584828">
-    <w:abstractNumId w:val="20"/>
+    <w:abstractNumId w:val="22"/>
   </w:num>
   <w:num w:numId="14" w16cid:durableId="1202093683">
-    <w:abstractNumId w:val="14"/>
+    <w:abstractNumId w:val="16"/>
   </w:num>
   <w:num w:numId="15" w16cid:durableId="1009065887">
-    <w:abstractNumId w:val="17"/>
+    <w:abstractNumId w:val="19"/>
   </w:num>
   <w:num w:numId="16" w16cid:durableId="1974556029">
     <w:abstractNumId w:val="5"/>
@@ -5035,10 +5325,10 @@
     <w:abstractNumId w:val="6"/>
   </w:num>
   <w:num w:numId="18" w16cid:durableId="953366019">
-    <w:abstractNumId w:val="16"/>
+    <w:abstractNumId w:val="18"/>
   </w:num>
   <w:num w:numId="19" w16cid:durableId="1440560564">
-    <w:abstractNumId w:val="18"/>
+    <w:abstractNumId w:val="20"/>
   </w:num>
   <w:num w:numId="20" w16cid:durableId="475341850">
     <w:abstractNumId w:val="11"/>
@@ -5053,10 +5343,10 @@
     <w:abstractNumId w:val="10"/>
   </w:num>
   <w:num w:numId="24" w16cid:durableId="516622675">
-    <w:abstractNumId w:val="21"/>
+    <w:abstractNumId w:val="23"/>
   </w:num>
   <w:num w:numId="25" w16cid:durableId="1912152259">
-    <w:abstractNumId w:val="19"/>
+    <w:abstractNumId w:val="21"/>
   </w:num>
   <w:num w:numId="26" w16cid:durableId="923687431">
     <w:abstractNumId w:val="7"/>
@@ -5068,10 +5358,16 @@
     <w:abstractNumId w:val="13"/>
   </w:num>
   <w:num w:numId="29" w16cid:durableId="1180119135">
-    <w:abstractNumId w:val="15"/>
+    <w:abstractNumId w:val="17"/>
   </w:num>
   <w:num w:numId="30" w16cid:durableId="1992365658">
     <w:abstractNumId w:val="8"/>
+  </w:num>
+  <w:num w:numId="31" w16cid:durableId="1710687967">
+    <w:abstractNumId w:val="15"/>
+  </w:num>
+  <w:num w:numId="32" w16cid:durableId="924412456">
+    <w:abstractNumId w:val="14"/>
   </w:num>
 </w:numbering>
 </file>

</xml_diff>